<commit_message>
Refresh product pages from Drive
</commit_message>
<xml_diff>
--- a/docs/page-links.docx
+++ b/docs/page-links.docx
@@ -172,6 +172,92 @@
                 <w:color w:val="1F2933"/>
                 <w:sz w:val="19"/>
               </w:rPr>
+              <w:t>眼鏡布_動物王國</w:t>
+            </w:r>
+          </w:p>
+        </w:tc>
+        <w:tc>
+          <w:tcPr>
+            <w:tcW w:type="dxa" w:w="2440"/>
+            <w:vAlign w:val="center"/>
+          </w:tcPr>
+          <w:p>
+            <w:pPr>
+              <w:spacing w:after="0"/>
+            </w:pPr>
+            <w:r/>
+            <w:r>
+              <w:rPr>
+                <w:rFonts w:ascii="Calibri" w:hAnsi="Calibri" w:eastAsia="Microsoft JhengHei"/>
+                <w:b w:val="0"/>
+                <w:color w:val="1F2933"/>
+                <w:sz w:val="19"/>
+              </w:rPr>
+              <w:t>products/animal-kingdom-cloth.html</w:t>
+            </w:r>
+          </w:p>
+        </w:tc>
+        <w:tc>
+          <w:tcPr>
+            <w:tcW w:type="dxa" w:w="2200"/>
+            <w:vAlign w:val="center"/>
+          </w:tcPr>
+          <w:p>
+            <w:pPr>
+              <w:spacing w:after="0"/>
+            </w:pPr>
+            <w:r/>
+            <w:r>
+              <w:rPr>
+                <w:rFonts w:ascii="Calibri" w:hAnsi="Calibri" w:eastAsia="Microsoft JhengHei"/>
+                <w:b w:val="0"/>
+                <w:color w:val="1F2933"/>
+                <w:sz w:val="19"/>
+              </w:rPr>
+              <w:t>products/animal-kingdom-cloth.html</w:t>
+            </w:r>
+          </w:p>
+        </w:tc>
+        <w:tc>
+          <w:tcPr>
+            <w:tcW w:type="dxa" w:w="2520"/>
+            <w:vAlign w:val="center"/>
+          </w:tcPr>
+          <w:p>
+            <w:pPr>
+              <w:spacing w:after="0"/>
+            </w:pPr>
+            <w:r/>
+            <w:hyperlink r:id="rId9">
+              <w:r>
+                <w:rPr>
+                  <w:color w:val="0F766E"/>
+                  <w:u w:val="single"/>
+                </w:rPr>
+                <w:t>https://jasonwongkwanho.github.io/shine-online-shop-specific-products-pages/products/animal-kingdom-cloth.html</w:t>
+              </w:r>
+            </w:hyperlink>
+          </w:p>
+        </w:tc>
+      </w:tr>
+      <w:tr>
+        <w:tc>
+          <w:tcPr>
+            <w:tcW w:type="dxa" w:w="2200"/>
+            <w:vAlign w:val="center"/>
+          </w:tcPr>
+          <w:p>
+            <w:pPr>
+              <w:spacing w:after="0"/>
+            </w:pPr>
+            <w:r/>
+            <w:r>
+              <w:rPr>
+                <w:rFonts w:ascii="Calibri" w:hAnsi="Calibri" w:eastAsia="Microsoft JhengHei"/>
+                <w:b w:val="0"/>
+                <w:color w:val="1F2933"/>
+                <w:sz w:val="19"/>
+              </w:rPr>
               <w:t>眼鏡布_名畫喵系列</w:t>
             </w:r>
           </w:p>
@@ -228,7 +314,7 @@
               <w:spacing w:after="0"/>
             </w:pPr>
             <w:r/>
-            <w:hyperlink r:id="rId9">
+            <w:hyperlink r:id="rId10">
               <w:r>
                 <w:rPr>
                   <w:color w:val="0F766E"/>
@@ -314,99 +400,13 @@
               <w:spacing w:after="0"/>
             </w:pPr>
             <w:r/>
-            <w:hyperlink r:id="rId10">
+            <w:hyperlink r:id="rId11">
               <w:r>
                 <w:rPr>
                   <w:color w:val="0F766E"/>
                   <w:u w:val="single"/>
                 </w:rPr>
                 <w:t>https://jasonwongkwanho.github.io/shine-online-shop-specific-products-pages/products/dog-statue-cloth.html</w:t>
-              </w:r>
-            </w:hyperlink>
-          </w:p>
-        </w:tc>
-      </w:tr>
-      <w:tr>
-        <w:tc>
-          <w:tcPr>
-            <w:tcW w:type="dxa" w:w="2200"/>
-            <w:vAlign w:val="center"/>
-          </w:tcPr>
-          <w:p>
-            <w:pPr>
-              <w:spacing w:after="0"/>
-            </w:pPr>
-            <w:r/>
-            <w:r>
-              <w:rPr>
-                <w:rFonts w:ascii="Calibri" w:hAnsi="Calibri" w:eastAsia="Microsoft JhengHei"/>
-                <w:b w:val="0"/>
-                <w:color w:val="1F2933"/>
-                <w:sz w:val="19"/>
-              </w:rPr>
-              <w:t>立體咭_環球系列</w:t>
-            </w:r>
-          </w:p>
-        </w:tc>
-        <w:tc>
-          <w:tcPr>
-            <w:tcW w:type="dxa" w:w="2440"/>
-            <w:vAlign w:val="center"/>
-          </w:tcPr>
-          <w:p>
-            <w:pPr>
-              <w:spacing w:after="0"/>
-            </w:pPr>
-            <w:r/>
-            <w:r>
-              <w:rPr>
-                <w:rFonts w:ascii="Calibri" w:hAnsi="Calibri" w:eastAsia="Microsoft JhengHei"/>
-                <w:b w:val="0"/>
-                <w:color w:val="1F2933"/>
-                <w:sz w:val="19"/>
-              </w:rPr>
-              <w:t>products/pop-up-world.html</w:t>
-            </w:r>
-          </w:p>
-        </w:tc>
-        <w:tc>
-          <w:tcPr>
-            <w:tcW w:type="dxa" w:w="2200"/>
-            <w:vAlign w:val="center"/>
-          </w:tcPr>
-          <w:p>
-            <w:pPr>
-              <w:spacing w:after="0"/>
-            </w:pPr>
-            <w:r/>
-            <w:r>
-              <w:rPr>
-                <w:rFonts w:ascii="Calibri" w:hAnsi="Calibri" w:eastAsia="Microsoft JhengHei"/>
-                <w:b w:val="0"/>
-                <w:color w:val="1F2933"/>
-                <w:sz w:val="19"/>
-              </w:rPr>
-              <w:t>products/pop-up-world.html</w:t>
-            </w:r>
-          </w:p>
-        </w:tc>
-        <w:tc>
-          <w:tcPr>
-            <w:tcW w:type="dxa" w:w="2520"/>
-            <w:vAlign w:val="center"/>
-          </w:tcPr>
-          <w:p>
-            <w:pPr>
-              <w:spacing w:after="0"/>
-            </w:pPr>
-            <w:r/>
-            <w:hyperlink r:id="rId11">
-              <w:r>
-                <w:rPr>
-                  <w:color w:val="0F766E"/>
-                  <w:u w:val="single"/>
-                </w:rPr>
-                <w:t>https://jasonwongkwanho.github.io/shine-online-shop-specific-products-pages/products/pop-up-world.html</w:t>
               </w:r>
             </w:hyperlink>
           </w:p>
@@ -516,6 +516,178 @@
                 <w:color w:val="1F2933"/>
                 <w:sz w:val="19"/>
               </w:rPr>
+              <w:t>蝶古巴特木杯墊</w:t>
+            </w:r>
+          </w:p>
+        </w:tc>
+        <w:tc>
+          <w:tcPr>
+            <w:tcW w:type="dxa" w:w="2440"/>
+            <w:vAlign w:val="center"/>
+          </w:tcPr>
+          <w:p>
+            <w:pPr>
+              <w:spacing w:after="0"/>
+            </w:pPr>
+            <w:r/>
+            <w:r>
+              <w:rPr>
+                <w:rFonts w:ascii="Calibri" w:hAnsi="Calibri" w:eastAsia="Microsoft JhengHei"/>
+                <w:b w:val="0"/>
+                <w:color w:val="1F2933"/>
+                <w:sz w:val="19"/>
+              </w:rPr>
+              <w:t>products/decoupage-coasters.html</w:t>
+            </w:r>
+          </w:p>
+        </w:tc>
+        <w:tc>
+          <w:tcPr>
+            <w:tcW w:type="dxa" w:w="2200"/>
+            <w:vAlign w:val="center"/>
+          </w:tcPr>
+          <w:p>
+            <w:pPr>
+              <w:spacing w:after="0"/>
+            </w:pPr>
+            <w:r/>
+            <w:r>
+              <w:rPr>
+                <w:rFonts w:ascii="Calibri" w:hAnsi="Calibri" w:eastAsia="Microsoft JhengHei"/>
+                <w:b w:val="0"/>
+                <w:color w:val="1F2933"/>
+                <w:sz w:val="19"/>
+              </w:rPr>
+              <w:t>products/decoupage-coasters.html</w:t>
+            </w:r>
+          </w:p>
+        </w:tc>
+        <w:tc>
+          <w:tcPr>
+            <w:tcW w:type="dxa" w:w="2520"/>
+            <w:vAlign w:val="center"/>
+          </w:tcPr>
+          <w:p>
+            <w:pPr>
+              <w:spacing w:after="0"/>
+            </w:pPr>
+            <w:r/>
+            <w:hyperlink r:id="rId13">
+              <w:r>
+                <w:rPr>
+                  <w:color w:val="0F766E"/>
+                  <w:u w:val="single"/>
+                </w:rPr>
+                <w:t>https://jasonwongkwanho.github.io/shine-online-shop-specific-products-pages/products/decoupage-coasters.html</w:t>
+              </w:r>
+            </w:hyperlink>
+          </w:p>
+        </w:tc>
+      </w:tr>
+      <w:tr>
+        <w:tc>
+          <w:tcPr>
+            <w:tcW w:type="dxa" w:w="2200"/>
+            <w:vAlign w:val="center"/>
+          </w:tcPr>
+          <w:p>
+            <w:pPr>
+              <w:spacing w:after="0"/>
+            </w:pPr>
+            <w:r/>
+            <w:r>
+              <w:rPr>
+                <w:rFonts w:ascii="Calibri" w:hAnsi="Calibri" w:eastAsia="Microsoft JhengHei"/>
+                <w:b w:val="0"/>
+                <w:color w:val="1F2933"/>
+                <w:sz w:val="19"/>
+              </w:rPr>
+              <w:t>立體咭_環球系列</w:t>
+            </w:r>
+          </w:p>
+        </w:tc>
+        <w:tc>
+          <w:tcPr>
+            <w:tcW w:type="dxa" w:w="2440"/>
+            <w:vAlign w:val="center"/>
+          </w:tcPr>
+          <w:p>
+            <w:pPr>
+              <w:spacing w:after="0"/>
+            </w:pPr>
+            <w:r/>
+            <w:r>
+              <w:rPr>
+                <w:rFonts w:ascii="Calibri" w:hAnsi="Calibri" w:eastAsia="Microsoft JhengHei"/>
+                <w:b w:val="0"/>
+                <w:color w:val="1F2933"/>
+                <w:sz w:val="19"/>
+              </w:rPr>
+              <w:t>products/pop-up-world.html</w:t>
+            </w:r>
+          </w:p>
+        </w:tc>
+        <w:tc>
+          <w:tcPr>
+            <w:tcW w:type="dxa" w:w="2200"/>
+            <w:vAlign w:val="center"/>
+          </w:tcPr>
+          <w:p>
+            <w:pPr>
+              <w:spacing w:after="0"/>
+            </w:pPr>
+            <w:r/>
+            <w:r>
+              <w:rPr>
+                <w:rFonts w:ascii="Calibri" w:hAnsi="Calibri" w:eastAsia="Microsoft JhengHei"/>
+                <w:b w:val="0"/>
+                <w:color w:val="1F2933"/>
+                <w:sz w:val="19"/>
+              </w:rPr>
+              <w:t>products/pop-up-world.html</w:t>
+            </w:r>
+          </w:p>
+        </w:tc>
+        <w:tc>
+          <w:tcPr>
+            <w:tcW w:type="dxa" w:w="2520"/>
+            <w:vAlign w:val="center"/>
+          </w:tcPr>
+          <w:p>
+            <w:pPr>
+              <w:spacing w:after="0"/>
+            </w:pPr>
+            <w:r/>
+            <w:hyperlink r:id="rId14">
+              <w:r>
+                <w:rPr>
+                  <w:color w:val="0F766E"/>
+                  <w:u w:val="single"/>
+                </w:rPr>
+                <w:t>https://jasonwongkwanho.github.io/shine-online-shop-specific-products-pages/products/pop-up-world.html</w:t>
+              </w:r>
+            </w:hyperlink>
+          </w:p>
+        </w:tc>
+      </w:tr>
+      <w:tr>
+        <w:tc>
+          <w:tcPr>
+            <w:tcW w:type="dxa" w:w="2200"/>
+            <w:vAlign w:val="center"/>
+          </w:tcPr>
+          <w:p>
+            <w:pPr>
+              <w:spacing w:after="0"/>
+            </w:pPr>
+            <w:r/>
+            <w:r>
+              <w:rPr>
+                <w:rFonts w:ascii="Calibri" w:hAnsi="Calibri" w:eastAsia="Microsoft JhengHei"/>
+                <w:b w:val="0"/>
+                <w:color w:val="1F2933"/>
+                <w:sz w:val="19"/>
+              </w:rPr>
               <w:t>立體咭_港式情懷</w:t>
             </w:r>
           </w:p>
@@ -572,13 +744,443 @@
               <w:spacing w:after="0"/>
             </w:pPr>
             <w:r/>
-            <w:hyperlink r:id="rId13">
+            <w:hyperlink r:id="rId15">
               <w:r>
                 <w:rPr>
                   <w:color w:val="0F766E"/>
                   <w:u w:val="single"/>
                 </w:rPr>
                 <w:t>https://jasonwongkwanho.github.io/shine-online-shop-specific-products-pages/products/pop-up-hong-kong.html</w:t>
+              </w:r>
+            </w:hyperlink>
+          </w:p>
+        </w:tc>
+      </w:tr>
+      <w:tr>
+        <w:tc>
+          <w:tcPr>
+            <w:tcW w:type="dxa" w:w="2200"/>
+            <w:vAlign w:val="center"/>
+          </w:tcPr>
+          <w:p>
+            <w:pPr>
+              <w:spacing w:after="0"/>
+            </w:pPr>
+            <w:r/>
+            <w:r>
+              <w:rPr>
+                <w:rFonts w:ascii="Calibri" w:hAnsi="Calibri" w:eastAsia="Microsoft JhengHei"/>
+                <w:b w:val="0"/>
+                <w:color w:val="1F2933"/>
+                <w:sz w:val="19"/>
+              </w:rPr>
+              <w:t>押花髮圈</w:t>
+            </w:r>
+          </w:p>
+        </w:tc>
+        <w:tc>
+          <w:tcPr>
+            <w:tcW w:type="dxa" w:w="2440"/>
+            <w:vAlign w:val="center"/>
+          </w:tcPr>
+          <w:p>
+            <w:pPr>
+              <w:spacing w:after="0"/>
+            </w:pPr>
+            <w:r/>
+            <w:r>
+              <w:rPr>
+                <w:rFonts w:ascii="Calibri" w:hAnsi="Calibri" w:eastAsia="Microsoft JhengHei"/>
+                <w:b w:val="0"/>
+                <w:color w:val="1F2933"/>
+                <w:sz w:val="19"/>
+              </w:rPr>
+              <w:t>products/pressed-flower-hair-ties.html</w:t>
+            </w:r>
+          </w:p>
+        </w:tc>
+        <w:tc>
+          <w:tcPr>
+            <w:tcW w:type="dxa" w:w="2200"/>
+            <w:vAlign w:val="center"/>
+          </w:tcPr>
+          <w:p>
+            <w:pPr>
+              <w:spacing w:after="0"/>
+            </w:pPr>
+            <w:r/>
+            <w:r>
+              <w:rPr>
+                <w:rFonts w:ascii="Calibri" w:hAnsi="Calibri" w:eastAsia="Microsoft JhengHei"/>
+                <w:b w:val="0"/>
+                <w:color w:val="1F2933"/>
+                <w:sz w:val="19"/>
+              </w:rPr>
+              <w:t>products/pressed-flower-hair-ties.html</w:t>
+            </w:r>
+          </w:p>
+        </w:tc>
+        <w:tc>
+          <w:tcPr>
+            <w:tcW w:type="dxa" w:w="2520"/>
+            <w:vAlign w:val="center"/>
+          </w:tcPr>
+          <w:p>
+            <w:pPr>
+              <w:spacing w:after="0"/>
+            </w:pPr>
+            <w:r/>
+            <w:hyperlink r:id="rId16">
+              <w:r>
+                <w:rPr>
+                  <w:color w:val="0F766E"/>
+                  <w:u w:val="single"/>
+                </w:rPr>
+                <w:t>https://jasonwongkwanho.github.io/shine-online-shop-specific-products-pages/products/pressed-flower-hair-ties.html</w:t>
+              </w:r>
+            </w:hyperlink>
+          </w:p>
+        </w:tc>
+      </w:tr>
+      <w:tr>
+        <w:tc>
+          <w:tcPr>
+            <w:tcW w:type="dxa" w:w="2200"/>
+            <w:vAlign w:val="center"/>
+          </w:tcPr>
+          <w:p>
+            <w:pPr>
+              <w:spacing w:after="0"/>
+            </w:pPr>
+            <w:r/>
+            <w:r>
+              <w:rPr>
+                <w:rFonts w:ascii="Calibri" w:hAnsi="Calibri" w:eastAsia="Microsoft JhengHei"/>
+                <w:b w:val="0"/>
+                <w:color w:val="1F2933"/>
+                <w:sz w:val="19"/>
+              </w:rPr>
+              <w:t>蝶古巴特筆筒</w:t>
+            </w:r>
+          </w:p>
+        </w:tc>
+        <w:tc>
+          <w:tcPr>
+            <w:tcW w:type="dxa" w:w="2440"/>
+            <w:vAlign w:val="center"/>
+          </w:tcPr>
+          <w:p>
+            <w:pPr>
+              <w:spacing w:after="0"/>
+            </w:pPr>
+            <w:r/>
+            <w:r>
+              <w:rPr>
+                <w:rFonts w:ascii="Calibri" w:hAnsi="Calibri" w:eastAsia="Microsoft JhengHei"/>
+                <w:b w:val="0"/>
+                <w:color w:val="1F2933"/>
+                <w:sz w:val="19"/>
+              </w:rPr>
+              <w:t>products/decoupage-pen-holder.html</w:t>
+            </w:r>
+          </w:p>
+        </w:tc>
+        <w:tc>
+          <w:tcPr>
+            <w:tcW w:type="dxa" w:w="2200"/>
+            <w:vAlign w:val="center"/>
+          </w:tcPr>
+          <w:p>
+            <w:pPr>
+              <w:spacing w:after="0"/>
+            </w:pPr>
+            <w:r/>
+            <w:r>
+              <w:rPr>
+                <w:rFonts w:ascii="Calibri" w:hAnsi="Calibri" w:eastAsia="Microsoft JhengHei"/>
+                <w:b w:val="0"/>
+                <w:color w:val="1F2933"/>
+                <w:sz w:val="19"/>
+              </w:rPr>
+              <w:t>products/decoupage-pen-holder.html</w:t>
+            </w:r>
+          </w:p>
+        </w:tc>
+        <w:tc>
+          <w:tcPr>
+            <w:tcW w:type="dxa" w:w="2520"/>
+            <w:vAlign w:val="center"/>
+          </w:tcPr>
+          <w:p>
+            <w:pPr>
+              <w:spacing w:after="0"/>
+            </w:pPr>
+            <w:r/>
+            <w:hyperlink r:id="rId17">
+              <w:r>
+                <w:rPr>
+                  <w:color w:val="0F766E"/>
+                  <w:u w:val="single"/>
+                </w:rPr>
+                <w:t>https://jasonwongkwanho.github.io/shine-online-shop-specific-products-pages/products/decoupage-pen-holder.html</w:t>
+              </w:r>
+            </w:hyperlink>
+          </w:p>
+        </w:tc>
+      </w:tr>
+      <w:tr>
+        <w:tc>
+          <w:tcPr>
+            <w:tcW w:type="dxa" w:w="2200"/>
+            <w:vAlign w:val="center"/>
+          </w:tcPr>
+          <w:p>
+            <w:pPr>
+              <w:spacing w:after="0"/>
+            </w:pPr>
+            <w:r/>
+            <w:r>
+              <w:rPr>
+                <w:rFonts w:ascii="Calibri" w:hAnsi="Calibri" w:eastAsia="Microsoft JhengHei"/>
+                <w:b w:val="0"/>
+                <w:color w:val="1F2933"/>
+                <w:sz w:val="19"/>
+              </w:rPr>
+              <w:t>蝶古巴特髮夾</w:t>
+            </w:r>
+          </w:p>
+        </w:tc>
+        <w:tc>
+          <w:tcPr>
+            <w:tcW w:type="dxa" w:w="2440"/>
+            <w:vAlign w:val="center"/>
+          </w:tcPr>
+          <w:p>
+            <w:pPr>
+              <w:spacing w:after="0"/>
+            </w:pPr>
+            <w:r/>
+            <w:r>
+              <w:rPr>
+                <w:rFonts w:ascii="Calibri" w:hAnsi="Calibri" w:eastAsia="Microsoft JhengHei"/>
+                <w:b w:val="0"/>
+                <w:color w:val="1F2933"/>
+                <w:sz w:val="19"/>
+              </w:rPr>
+              <w:t>products/decoupage-hair-clip.html</w:t>
+            </w:r>
+          </w:p>
+        </w:tc>
+        <w:tc>
+          <w:tcPr>
+            <w:tcW w:type="dxa" w:w="2200"/>
+            <w:vAlign w:val="center"/>
+          </w:tcPr>
+          <w:p>
+            <w:pPr>
+              <w:spacing w:after="0"/>
+            </w:pPr>
+            <w:r/>
+            <w:r>
+              <w:rPr>
+                <w:rFonts w:ascii="Calibri" w:hAnsi="Calibri" w:eastAsia="Microsoft JhengHei"/>
+                <w:b w:val="0"/>
+                <w:color w:val="1F2933"/>
+                <w:sz w:val="19"/>
+              </w:rPr>
+              <w:t>products/decoupage-hair-clip.html</w:t>
+            </w:r>
+          </w:p>
+        </w:tc>
+        <w:tc>
+          <w:tcPr>
+            <w:tcW w:type="dxa" w:w="2520"/>
+            <w:vAlign w:val="center"/>
+          </w:tcPr>
+          <w:p>
+            <w:pPr>
+              <w:spacing w:after="0"/>
+            </w:pPr>
+            <w:r/>
+            <w:hyperlink r:id="rId18">
+              <w:r>
+                <w:rPr>
+                  <w:color w:val="0F766E"/>
+                  <w:u w:val="single"/>
+                </w:rPr>
+                <w:t>https://jasonwongkwanho.github.io/shine-online-shop-specific-products-pages/products/decoupage-hair-clip.html</w:t>
+              </w:r>
+            </w:hyperlink>
+          </w:p>
+        </w:tc>
+      </w:tr>
+      <w:tr>
+        <w:tc>
+          <w:tcPr>
+            <w:tcW w:type="dxa" w:w="2200"/>
+            <w:vAlign w:val="center"/>
+          </w:tcPr>
+          <w:p>
+            <w:pPr>
+              <w:spacing w:after="0"/>
+            </w:pPr>
+            <w:r/>
+            <w:r>
+              <w:rPr>
+                <w:rFonts w:ascii="Calibri" w:hAnsi="Calibri" w:eastAsia="Microsoft JhengHei"/>
+                <w:b w:val="0"/>
+                <w:color w:val="1F2933"/>
+                <w:sz w:val="19"/>
+              </w:rPr>
+              <w:t>蝶古巴特麻布袋_A4</w:t>
+            </w:r>
+          </w:p>
+        </w:tc>
+        <w:tc>
+          <w:tcPr>
+            <w:tcW w:type="dxa" w:w="2440"/>
+            <w:vAlign w:val="center"/>
+          </w:tcPr>
+          <w:p>
+            <w:pPr>
+              <w:spacing w:after="0"/>
+            </w:pPr>
+            <w:r/>
+            <w:r>
+              <w:rPr>
+                <w:rFonts w:ascii="Calibri" w:hAnsi="Calibri" w:eastAsia="Microsoft JhengHei"/>
+                <w:b w:val="0"/>
+                <w:color w:val="1F2933"/>
+                <w:sz w:val="19"/>
+              </w:rPr>
+              <w:t>products/decoupage-a4-bag.html</w:t>
+            </w:r>
+          </w:p>
+        </w:tc>
+        <w:tc>
+          <w:tcPr>
+            <w:tcW w:type="dxa" w:w="2200"/>
+            <w:vAlign w:val="center"/>
+          </w:tcPr>
+          <w:p>
+            <w:pPr>
+              <w:spacing w:after="0"/>
+            </w:pPr>
+            <w:r/>
+            <w:r>
+              <w:rPr>
+                <w:rFonts w:ascii="Calibri" w:hAnsi="Calibri" w:eastAsia="Microsoft JhengHei"/>
+                <w:b w:val="0"/>
+                <w:color w:val="1F2933"/>
+                <w:sz w:val="19"/>
+              </w:rPr>
+              <w:t>products/decoupage-a4-bag.html</w:t>
+            </w:r>
+          </w:p>
+        </w:tc>
+        <w:tc>
+          <w:tcPr>
+            <w:tcW w:type="dxa" w:w="2520"/>
+            <w:vAlign w:val="center"/>
+          </w:tcPr>
+          <w:p>
+            <w:pPr>
+              <w:spacing w:after="0"/>
+            </w:pPr>
+            <w:r/>
+            <w:hyperlink r:id="rId19">
+              <w:r>
+                <w:rPr>
+                  <w:color w:val="0F766E"/>
+                  <w:u w:val="single"/>
+                </w:rPr>
+                <w:t>https://jasonwongkwanho.github.io/shine-online-shop-specific-products-pages/products/decoupage-a4-bag.html</w:t>
+              </w:r>
+            </w:hyperlink>
+          </w:p>
+        </w:tc>
+      </w:tr>
+      <w:tr>
+        <w:tc>
+          <w:tcPr>
+            <w:tcW w:type="dxa" w:w="2200"/>
+            <w:vAlign w:val="center"/>
+          </w:tcPr>
+          <w:p>
+            <w:pPr>
+              <w:spacing w:after="0"/>
+            </w:pPr>
+            <w:r/>
+            <w:r>
+              <w:rPr>
+                <w:rFonts w:ascii="Calibri" w:hAnsi="Calibri" w:eastAsia="Microsoft JhengHei"/>
+                <w:b w:val="0"/>
+                <w:color w:val="1F2933"/>
+                <w:sz w:val="19"/>
+              </w:rPr>
+              <w:t>蝶古巴特麻布袋_A5</w:t>
+            </w:r>
+          </w:p>
+        </w:tc>
+        <w:tc>
+          <w:tcPr>
+            <w:tcW w:type="dxa" w:w="2440"/>
+            <w:vAlign w:val="center"/>
+          </w:tcPr>
+          <w:p>
+            <w:pPr>
+              <w:spacing w:after="0"/>
+            </w:pPr>
+            <w:r/>
+            <w:r>
+              <w:rPr>
+                <w:rFonts w:ascii="Calibri" w:hAnsi="Calibri" w:eastAsia="Microsoft JhengHei"/>
+                <w:b w:val="0"/>
+                <w:color w:val="1F2933"/>
+                <w:sz w:val="19"/>
+              </w:rPr>
+              <w:t>products/decoupage-a5-bag.html</w:t>
+            </w:r>
+          </w:p>
+        </w:tc>
+        <w:tc>
+          <w:tcPr>
+            <w:tcW w:type="dxa" w:w="2200"/>
+            <w:vAlign w:val="center"/>
+          </w:tcPr>
+          <w:p>
+            <w:pPr>
+              <w:spacing w:after="0"/>
+            </w:pPr>
+            <w:r/>
+            <w:r>
+              <w:rPr>
+                <w:rFonts w:ascii="Calibri" w:hAnsi="Calibri" w:eastAsia="Microsoft JhengHei"/>
+                <w:b w:val="0"/>
+                <w:color w:val="1F2933"/>
+                <w:sz w:val="19"/>
+              </w:rPr>
+              <w:t>products/decoupage-a5-bag.html</w:t>
+            </w:r>
+          </w:p>
+        </w:tc>
+        <w:tc>
+          <w:tcPr>
+            <w:tcW w:type="dxa" w:w="2520"/>
+            <w:vAlign w:val="center"/>
+          </w:tcPr>
+          <w:p>
+            <w:pPr>
+              <w:spacing w:after="0"/>
+            </w:pPr>
+            <w:r/>
+            <w:hyperlink r:id="rId20">
+              <w:r>
+                <w:rPr>
+                  <w:color w:val="0F766E"/>
+                  <w:u w:val="single"/>
+                </w:rPr>
+                <w:t>https://jasonwongkwanho.github.io/shine-online-shop-specific-products-pages/products/decoupage-a5-bag.html</w:t>
               </w:r>
             </w:hyperlink>
           </w:p>
@@ -596,7 +1198,7 @@
           <w:color w:val="65758B"/>
           <w:sz w:val="19"/>
         </w:rPr>
-        <w:t>備註：頁面內圖片使用 Google Drive 圖片縮圖連結。正式公開前，請確保原 Drive 圖片或上層 folder 已設定為「知道連結的任何人均可查看」。</w:t>
+        <w:t>備註：頁面內圖片已轉為 GitHub Pages 本地 WebP 圖片；「開啟原圖」按鈕仍會連到 Google Drive 原圖。</w:t>
       </w:r>
     </w:p>
     <w:sectPr>

</xml_diff>

<commit_message>
Fix product page title encoding
</commit_message>
<xml_diff>
--- a/docs/page-links.docx
+++ b/docs/page-links.docx
@@ -172,7 +172,7 @@
                 <w:color w:val="1F2933"/>
                 <w:sz w:val="19"/>
               </w:rPr>
-              <w:t>???_????</w:t>
+              <w:t>眼鏡布_動物王國</w:t>
             </w:r>
           </w:p>
         </w:tc>
@@ -258,7 +258,7 @@
                 <w:color w:val="1F2933"/>
                 <w:sz w:val="19"/>
               </w:rPr>
-              <w:t>???_?????</w:t>
+              <w:t>眼鏡布_名畫喵系列</w:t>
             </w:r>
           </w:p>
         </w:tc>
@@ -344,7 +344,7 @@
                 <w:color w:val="1F2933"/>
                 <w:sz w:val="19"/>
               </w:rPr>
-              <w:t>???_?????</w:t>
+              <w:t>眼鏡布_犬雕像系列</w:t>
             </w:r>
           </w:p>
         </w:tc>
@@ -430,7 +430,7 @@
                 <w:color w:val="1F2933"/>
                 <w:sz w:val="19"/>
               </w:rPr>
-              <w:t>???_????</w:t>
+              <w:t>立體咭_節慶系列</w:t>
             </w:r>
           </w:p>
         </w:tc>
@@ -516,7 +516,7 @@
                 <w:color w:val="1F2933"/>
                 <w:sz w:val="19"/>
               </w:rPr>
-              <w:t>???????</w:t>
+              <w:t>蝶古巴特木杯墊</w:t>
             </w:r>
           </w:p>
         </w:tc>
@@ -602,7 +602,7 @@
                 <w:color w:val="1F2933"/>
                 <w:sz w:val="19"/>
               </w:rPr>
-              <w:t>???_????</w:t>
+              <w:t>立體咭_環球系列</w:t>
             </w:r>
           </w:p>
         </w:tc>
@@ -688,7 +688,7 @@
                 <w:color w:val="1F2933"/>
                 <w:sz w:val="19"/>
               </w:rPr>
-              <w:t>???_????</w:t>
+              <w:t>立體咭_港式情懷</w:t>
             </w:r>
           </w:p>
         </w:tc>
@@ -774,7 +774,7 @@
                 <w:color w:val="1F2933"/>
                 <w:sz w:val="19"/>
               </w:rPr>
-              <w:t>??????</w:t>
+              <w:t>蝶古巴特筆筒</w:t>
             </w:r>
           </w:p>
         </w:tc>
@@ -860,7 +860,7 @@
                 <w:color w:val="1F2933"/>
                 <w:sz w:val="19"/>
               </w:rPr>
-              <w:t>??????</w:t>
+              <w:t>蝶古巴特髮夾</w:t>
             </w:r>
           </w:p>
         </w:tc>
@@ -946,7 +946,7 @@
                 <w:color w:val="1F2933"/>
                 <w:sz w:val="19"/>
               </w:rPr>
-              <w:t>???????_A4</w:t>
+              <w:t>蝶古巴特麻布袋_A4</w:t>
             </w:r>
           </w:p>
         </w:tc>
@@ -1032,7 +1032,7 @@
                 <w:color w:val="1F2933"/>
                 <w:sz w:val="19"/>
               </w:rPr>
-              <w:t>???????_A5</w:t>
+              <w:t>蝶古巴特麻布袋_A5</w:t>
             </w:r>
           </w:p>
         </w:tc>

</xml_diff>

<commit_message>
Move product page links to po-kwong
</commit_message>
<xml_diff>
--- a/docs/page-links.docx
+++ b/docs/page-links.docx
@@ -42,7 +42,7 @@
           <w:color w:val="65758B"/>
           <w:sz w:val="20"/>
         </w:rPr>
-        <w:t>GitHub Pages 根網址：https://jasonwongkwanho.github.io/shine-online-shop-specific-products-pages/</w:t>
+        <w:t>GitHub Pages 根網址：https://po-kwong.github.io/shine-online-shop-specific-products-pages/</w:t>
       </w:r>
     </w:p>
     <w:tbl>
@@ -234,7 +234,7 @@
                   <w:color w:val="0F766E"/>
                   <w:u w:val="single"/>
                 </w:rPr>
-                <w:t>https://jasonwongkwanho.github.io/shine-online-shop-specific-products-pages/products/animal-kingdom-cloth.html</w:t>
+                <w:t>https://po-kwong.github.io/shine-online-shop-specific-products-pages/products/animal-kingdom-cloth.html</w:t>
               </w:r>
             </w:hyperlink>
           </w:p>
@@ -320,7 +320,7 @@
                   <w:color w:val="0F766E"/>
                   <w:u w:val="single"/>
                 </w:rPr>
-                <w:t>https://jasonwongkwanho.github.io/shine-online-shop-specific-products-pages/products/masterpiece-cat-cloth.html</w:t>
+                <w:t>https://po-kwong.github.io/shine-online-shop-specific-products-pages/products/masterpiece-cat-cloth.html</w:t>
               </w:r>
             </w:hyperlink>
           </w:p>
@@ -406,7 +406,7 @@
                   <w:color w:val="0F766E"/>
                   <w:u w:val="single"/>
                 </w:rPr>
-                <w:t>https://jasonwongkwanho.github.io/shine-online-shop-specific-products-pages/products/dog-statue-cloth.html</w:t>
+                <w:t>https://po-kwong.github.io/shine-online-shop-specific-products-pages/products/dog-statue-cloth.html</w:t>
               </w:r>
             </w:hyperlink>
           </w:p>
@@ -492,7 +492,7 @@
                   <w:color w:val="0F766E"/>
                   <w:u w:val="single"/>
                 </w:rPr>
-                <w:t>https://jasonwongkwanho.github.io/shine-online-shop-specific-products-pages/products/pop-up-festival.html</w:t>
+                <w:t>https://po-kwong.github.io/shine-online-shop-specific-products-pages/products/pop-up-festival.html</w:t>
               </w:r>
             </w:hyperlink>
           </w:p>
@@ -578,7 +578,7 @@
                   <w:color w:val="0F766E"/>
                   <w:u w:val="single"/>
                 </w:rPr>
-                <w:t>https://jasonwongkwanho.github.io/shine-online-shop-specific-products-pages/products/decoupage-coasters.html</w:t>
+                <w:t>https://po-kwong.github.io/shine-online-shop-specific-products-pages/products/decoupage-coasters.html</w:t>
               </w:r>
             </w:hyperlink>
           </w:p>
@@ -664,7 +664,7 @@
                   <w:color w:val="0F766E"/>
                   <w:u w:val="single"/>
                 </w:rPr>
-                <w:t>https://jasonwongkwanho.github.io/shine-online-shop-specific-products-pages/products/pop-up-world.html</w:t>
+                <w:t>https://po-kwong.github.io/shine-online-shop-specific-products-pages/products/pop-up-world.html</w:t>
               </w:r>
             </w:hyperlink>
           </w:p>
@@ -750,7 +750,7 @@
                   <w:color w:val="0F766E"/>
                   <w:u w:val="single"/>
                 </w:rPr>
-                <w:t>https://jasonwongkwanho.github.io/shine-online-shop-specific-products-pages/products/pop-up-hong-kong.html</w:t>
+                <w:t>https://po-kwong.github.io/shine-online-shop-specific-products-pages/products/pop-up-hong-kong.html</w:t>
               </w:r>
             </w:hyperlink>
           </w:p>
@@ -836,7 +836,7 @@
                   <w:color w:val="0F766E"/>
                   <w:u w:val="single"/>
                 </w:rPr>
-                <w:t>https://jasonwongkwanho.github.io/shine-online-shop-specific-products-pages/products/decoupage-pen-holder.html</w:t>
+                <w:t>https://po-kwong.github.io/shine-online-shop-specific-products-pages/products/decoupage-pen-holder.html</w:t>
               </w:r>
             </w:hyperlink>
           </w:p>
@@ -922,7 +922,7 @@
                   <w:color w:val="0F766E"/>
                   <w:u w:val="single"/>
                 </w:rPr>
-                <w:t>https://jasonwongkwanho.github.io/shine-online-shop-specific-products-pages/products/decoupage-hair-clip.html</w:t>
+                <w:t>https://po-kwong.github.io/shine-online-shop-specific-products-pages/products/decoupage-hair-clip.html</w:t>
               </w:r>
             </w:hyperlink>
           </w:p>
@@ -1008,7 +1008,7 @@
                   <w:color w:val="0F766E"/>
                   <w:u w:val="single"/>
                 </w:rPr>
-                <w:t>https://jasonwongkwanho.github.io/shine-online-shop-specific-products-pages/products/decoupage-a4-bag.html</w:t>
+                <w:t>https://po-kwong.github.io/shine-online-shop-specific-products-pages/products/decoupage-a4-bag.html</w:t>
               </w:r>
             </w:hyperlink>
           </w:p>
@@ -1094,7 +1094,7 @@
                   <w:color w:val="0F766E"/>
                   <w:u w:val="single"/>
                 </w:rPr>
-                <w:t>https://jasonwongkwanho.github.io/shine-online-shop-specific-products-pages/products/decoupage-a5-bag.html</w:t>
+                <w:t>https://po-kwong.github.io/shine-online-shop-specific-products-pages/products/decoupage-a5-bag.html</w:t>
               </w:r>
             </w:hyperlink>
           </w:p>

</xml_diff>

<commit_message>
Refresh product pages and add decoupage tissue boxes
</commit_message>
<xml_diff>
--- a/docs/page-links.docx
+++ b/docs/page-links.docx
@@ -1100,6 +1100,92 @@
           </w:p>
         </w:tc>
       </w:tr>
+      <w:tr>
+        <w:tc>
+          <w:tcPr>
+            <w:tcW w:type="dxa" w:w="2200"/>
+            <w:vAlign w:val="center"/>
+          </w:tcPr>
+          <w:p>
+            <w:pPr>
+              <w:spacing w:after="0"/>
+            </w:pPr>
+            <w:r/>
+            <w:r>
+              <w:rPr>
+                <w:rFonts w:ascii="Calibri" w:hAnsi="Calibri" w:eastAsia="Microsoft JhengHei"/>
+                <w:b w:val="0"/>
+                <w:color w:val="1F2933"/>
+                <w:sz w:val="19"/>
+              </w:rPr>
+              <w:t>蝶古巴特紙巾盒</w:t>
+            </w:r>
+          </w:p>
+        </w:tc>
+        <w:tc>
+          <w:tcPr>
+            <w:tcW w:type="dxa" w:w="2440"/>
+            <w:vAlign w:val="center"/>
+          </w:tcPr>
+          <w:p>
+            <w:pPr>
+              <w:spacing w:after="0"/>
+            </w:pPr>
+            <w:r/>
+            <w:r>
+              <w:rPr>
+                <w:rFonts w:ascii="Calibri" w:hAnsi="Calibri" w:eastAsia="Microsoft JhengHei"/>
+                <w:b w:val="0"/>
+                <w:color w:val="1F2933"/>
+                <w:sz w:val="19"/>
+              </w:rPr>
+              <w:t>products/decoupage-tissue-box.html</w:t>
+            </w:r>
+          </w:p>
+        </w:tc>
+        <w:tc>
+          <w:tcPr>
+            <w:tcW w:type="dxa" w:w="2200"/>
+            <w:vAlign w:val="center"/>
+          </w:tcPr>
+          <w:p>
+            <w:pPr>
+              <w:spacing w:after="0"/>
+            </w:pPr>
+            <w:r/>
+            <w:r>
+              <w:rPr>
+                <w:rFonts w:ascii="Calibri" w:hAnsi="Calibri" w:eastAsia="Microsoft JhengHei"/>
+                <w:b w:val="0"/>
+                <w:color w:val="1F2933"/>
+                <w:sz w:val="19"/>
+              </w:rPr>
+              <w:t>products/decoupage-tissue-box.html</w:t>
+            </w:r>
+          </w:p>
+        </w:tc>
+        <w:tc>
+          <w:tcPr>
+            <w:tcW w:type="dxa" w:w="2520"/>
+            <w:vAlign w:val="center"/>
+          </w:tcPr>
+          <w:p>
+            <w:pPr>
+              <w:spacing w:after="0"/>
+            </w:pPr>
+            <w:r/>
+            <w:hyperlink r:id="rId20">
+              <w:r>
+                <w:rPr>
+                  <w:color w:val="0F766E"/>
+                  <w:u w:val="single"/>
+                </w:rPr>
+                <w:t>https://po-kwong.github.io/shine-online-shop-specific-products-pages/products/decoupage-tissue-box.html</w:t>
+              </w:r>
+            </w:hyperlink>
+          </w:p>
+        </w:tc>
+      </w:tr>
     </w:tbl>
     <w:p>
       <w:pPr>

</xml_diff>